<commit_message>
Ajout chapitre 3 5ème
</commit_message>
<xml_diff>
--- a/Cours/6eme/SaintExupery/Chapitre_2_4/Documents/Chapitre 2 - Partie 4 - Division décimale (Complet).docx
+++ b/Cours/6eme/SaintExupery/Chapitre_2_4/Documents/Chapitre 2 - Partie 4 - Division décimale (Complet).docx
@@ -1845,7 +1845,19 @@
         </w:rPr>
       </w:pPr>
       <w:r>
-        <w:t>Certaines divisions ne s’arrêtent pas, on s'arrête donc lorsque l'un des reste dans la partie décimal est identique à l'un des précédents.</w:t>
+        <w:t>Certaines divisions ne s’arrêtent pas, on s'arrête donc lorsque l'un des reste</w:t>
+      </w:r>
+      <w:r>
+        <w:t>s</w:t>
+      </w:r>
+      <w:r>
+        <w:t xml:space="preserve"> dans la partie décimal</w:t>
+      </w:r>
+      <w:r>
+        <w:t>e</w:t>
+      </w:r>
+      <w:r>
+        <w:t xml:space="preserve"> est identique à l'un des précédents.</w:t>
       </w:r>
     </w:p>
     <w:tbl>

</xml_diff>